<commit_message>
Lab 1 r11: 14 participant dry-run fixes from Tim's walkthrough
</commit_message>
<xml_diff>
--- a/workshop-site/labs/Lab 01 - Instructor Notes.docx
+++ b/workshop-site/labs/Lab 01 - Instructor Notes.docx
@@ -25,7 +25,7 @@
           <w:color w:val="6A6A6A"/>
           <w:sz w:val="20"/>
         </w:rPr>
-        <w:t>Extend the Case Object for Multi-Agency Intake | ServicePulse 360 Workshop v0.7 (revision 10) | Facilitator guide to the Participant guide of the same name | about 100 min of participant time | about 115 min of instructor time if you present every teaching moment</w:t>
+        <w:t>Extend the Case Object for Multi-Agency Intake | ServicePulse 360 Workshop v0.7 (revision 11) | Facilitator guide to the Participant guide of the same name | about 100 min of participant time | about 115 min of instructor time if you present every teaching moment</w:t>
       </w:r>
     </w:p>
     <w:p>
@@ -38,12 +38,12 @@
           <w:color w:val="1F4E79"/>
           <w:sz w:val="28"/>
         </w:rPr>
-        <w:t>What changed from r9</w:t>
+        <w:t>What changed from r10</w:t>
       </w:r>
     </w:p>
     <w:p>
       <w:r>
-        <w:t>Round 19 feedback: Lab 6 needs the Dashboards tab in the ServicePulse 360 app. Added here in Lab 1 Part 0 so it is present from the start.</w:t>
+        <w:t>Round 20 feedback: 14 participant-dry-run fixes applied for the 2026-10-20 workshop. The user-facing clarifications mostly tighten navigation preambles and remove ambiguity; mirror them here so instructor notes stay aligned.</w:t>
       </w:r>
     </w:p>
     <w:p>
@@ -52,7 +52,7 @@
         <w:spacing w:after="40"/>
       </w:pPr>
       <w:r>
-        <w:t>Part 0 Navigation Items step now adds Cases, Reports, AND Dashboards (previously just Cases and Reports).</w:t>
+        <w:t>Part 0 Step 1: click New App then select New Lightning App from the menu (the top-right control is labeled New App; the Lightning option is on the dropdown).</w:t>
       </w:r>
     </w:p>
     <w:p>
@@ -61,7 +61,97 @@
         <w:spacing w:after="40"/>
       </w:pPr>
       <w:r>
-        <w:t>No other changes.</w:t>
+        <w:t>Part 0 Open the app: participants now also drag ServicePulse 360 to the top of the View All list.</w:t>
+      </w:r>
+    </w:p>
+    <w:p>
+      <w:pPr>
+        <w:pStyle w:val="ListBullet"/>
+        <w:spacing w:after="40"/>
+      </w:pPr>
+      <w:r>
+        <w:t>Part 1 Step 2: Quick Find alternative added to filter Object Manager.</w:t>
+      </w:r>
+    </w:p>
+    <w:p>
+      <w:pPr>
+        <w:pStyle w:val="ListBullet"/>
+        <w:spacing w:after="40"/>
+      </w:pPr>
+      <w:r>
+        <w:t>Part 2 opens with an explicit navigation preamble to Object Manager &gt; Case &gt; Fields &amp; Relationships.</w:t>
+      </w:r>
+    </w:p>
+    <w:p>
+      <w:pPr>
+        <w:pStyle w:val="ListBullet"/>
+        <w:spacing w:after="40"/>
+      </w:pPr>
+      <w:r>
+        <w:t>Part 2 removed the stale 'Same physical interface as adding a new picklist field' paragraph.</w:t>
+      </w:r>
+    </w:p>
+    <w:p>
+      <w:pPr>
+        <w:pStyle w:val="ListBullet"/>
+        <w:spacing w:after="40"/>
+      </w:pPr>
+      <w:r>
+        <w:t>Part 2.1 now splits default-setting from deactivation into separate steps and adds a Watch Out about the 15-30s UI delay on Deactivate.</w:t>
+      </w:r>
+    </w:p>
+    <w:p>
+      <w:pPr>
+        <w:pStyle w:val="ListBullet"/>
+        <w:spacing w:after="40"/>
+      </w:pPr>
+      <w:r>
+        <w:t>Part 2.2 Step 1 now clarifies to click the Field Label 'Type' row (not any section heading containing the word Type).</w:t>
+      </w:r>
+    </w:p>
+    <w:p>
+      <w:pPr>
+        <w:pStyle w:val="ListBullet"/>
+        <w:spacing w:after="40"/>
+      </w:pPr>
+      <w:r>
+        <w:t>Part 3.1 begins with an explicit navigation step to Fields &amp; Relationships.</w:t>
+      </w:r>
+    </w:p>
+    <w:p>
+      <w:pPr>
+        <w:pStyle w:val="ListBullet"/>
+        <w:spacing w:after="40"/>
+      </w:pPr>
+      <w:r>
+        <w:t>Part 4.1 clarifies to click the field 'Status' (not any section titled 'Case Status').</w:t>
+      </w:r>
+    </w:p>
+    <w:p>
+      <w:pPr>
+        <w:pStyle w:val="ListBullet"/>
+        <w:spacing w:after="40"/>
+      </w:pPr>
+      <w:r>
+        <w:t>Part 4.2 Support Processes navigation is now explicit numbered steps rather than prose.</w:t>
+      </w:r>
+    </w:p>
+    <w:p>
+      <w:pPr>
+        <w:pStyle w:val="ListBullet"/>
+        <w:spacing w:after="40"/>
+      </w:pPr>
+      <w:r>
+        <w:t>Part 5.1 - 5.4 each start with an explicit navigation step to the Case Record Types page and clicking New.</w:t>
+      </w:r>
+    </w:p>
+    <w:p>
+      <w:pPr>
+        <w:pStyle w:val="ListBullet"/>
+        <w:spacing w:after="40"/>
+      </w:pPr>
+      <w:r>
+        <w:t>Part 5.1 - 5.4 Page Layout assignment: participants now explicitly select 'Case Layout' from the dropdown (instead of 'leave default').</w:t>
       </w:r>
     </w:p>
     <w:p>
@@ -434,7 +524,39 @@
         <w:t xml:space="preserve">Common error: </w:t>
       </w:r>
       <w:r>
+        <w:t>Participant clicks 'New App' and expects a single-screen wizard. The top-right button is actually a split dropdown; they must select 'New Lightning App' from the menu. If they land on the Connected App flow instead, back out and reselect.</w:t>
+      </w:r>
+    </w:p>
+    <w:p>
+      <w:pPr>
+        <w:spacing w:before="80" w:after="80"/>
+        <w:ind w:left="227"/>
+      </w:pPr>
+      <w:r>
+        <w:rPr>
+          <w:b/>
+          <w:color w:val="C0392B"/>
+        </w:rPr>
+        <w:t xml:space="preserve">Common error: </w:t>
+      </w:r>
+      <w:r>
         <w:t>Participant forgets to assign System Administrator in User Profiles step. Symptom: after Save &amp; Finish, they can't find ServicePulse 360 in the App Launcher. Fix: Setup then App Manager then ServicePulse 360 then Edit then User Profiles then add System Administrator then Save.</w:t>
+      </w:r>
+    </w:p>
+    <w:p>
+      <w:pPr>
+        <w:spacing w:before="80" w:after="80"/>
+        <w:ind w:left="227"/>
+      </w:pPr>
+      <w:r>
+        <w:rPr>
+          <w:b/>
+          <w:color w:val="2E75B6"/>
+        </w:rPr>
+        <w:t xml:space="preserve">Tip: </w:t>
+      </w:r>
+      <w:r>
+        <w:t>After opening the app, participants reorder ServicePulse 360 to the top of the App Launcher's View All grid. Walk the room on this; drag-reorder is a hover-and-drag gesture that's easy to miss.</w:t>
       </w:r>
     </w:p>
     <w:p>
@@ -468,6 +590,22 @@
     </w:p>
     <w:p>
       <w:pPr>
+        <w:spacing w:before="80" w:after="80"/>
+        <w:ind w:left="227"/>
+      </w:pPr>
+      <w:r>
+        <w:rPr>
+          <w:b/>
+          <w:color w:val="2E75B6"/>
+        </w:rPr>
+        <w:t xml:space="preserve">Tip: </w:t>
+      </w:r>
+      <w:r>
+        <w:t>Model Quick Find at the top of the Object Manager list on your projected screen. Many participants scroll by habit; the Quick Find filter is faster and reinforces the pattern they'll use throughout Setup.</w:t>
+      </w:r>
+    </w:p>
+    <w:p>
+      <w:pPr>
         <w:spacing w:before="280" w:after="80"/>
       </w:pPr>
       <w:r>
@@ -503,6 +641,38 @@
       <w:r>
         <w:rPr>
           <w:b/>
+          <w:color w:val="2E75B6"/>
+        </w:rPr>
+        <w:t xml:space="preserve">Tip: </w:t>
+      </w:r>
+      <w:r>
+        <w:t>Order matters: participants now set P3 - Medium as the default BEFORE deactivating High/Medium/Low. If they deactivate first, 'Default' column collapses and they lose the visual anchor.</w:t>
+      </w:r>
+    </w:p>
+    <w:p>
+      <w:pPr>
+        <w:spacing w:before="80" w:after="80"/>
+        <w:ind w:left="227"/>
+      </w:pPr>
+      <w:r>
+        <w:rPr>
+          <w:b/>
+          <w:color w:val="C0392B"/>
+        </w:rPr>
+        <w:t xml:space="preserve">Common error: </w:t>
+      </w:r>
+      <w:r>
+        <w:t>After participant clicks Deactivate on High, the row still shows in Active Values. They panic and click Deactivate again. The UI is just slow (15-30s). Reinforce: refresh the page before deactivating the next value.</w:t>
+      </w:r>
+    </w:p>
+    <w:p>
+      <w:pPr>
+        <w:spacing w:before="80" w:after="80"/>
+        <w:ind w:left="227"/>
+      </w:pPr>
+      <w:r>
+        <w:rPr>
+          <w:b/>
           <w:color w:val="C0392B"/>
         </w:rPr>
         <w:t xml:space="preserve">Common error: </w:t>
@@ -529,6 +699,22 @@
     </w:p>
     <w:p>
       <w:pPr>
+        <w:spacing w:before="80" w:after="80"/>
+        <w:ind w:left="227"/>
+      </w:pPr>
+      <w:r>
+        <w:rPr>
+          <w:b/>
+          <w:color w:val="C0392B"/>
+        </w:rPr>
+        <w:t xml:space="preserve">Common error: </w:t>
+      </w:r>
+      <w:r>
+        <w:t>Participant in 2.2 clicks a 'Case Type' heading or picklist values header instead of the Type field row. Symptom: wrong detail page or no detail page opens. Fix: in Fields &amp; Relationships, click the row whose Field Label is literally 'Type'.</w:t>
+      </w:r>
+    </w:p>
+    <w:p>
+      <w:pPr>
         <w:spacing w:before="280" w:after="80"/>
       </w:pPr>
       <w:r>
@@ -615,6 +801,38 @@
       </w:r>
       <w:r>
         <w:t>Explain why Case has a Support Process at all. Case, Lead, and Opportunity each have a built-in lifecycle Salesforce protects via a controlling process.</w:t>
+      </w:r>
+    </w:p>
+    <w:p>
+      <w:pPr>
+        <w:spacing w:before="80" w:after="80"/>
+        <w:ind w:left="227"/>
+      </w:pPr>
+      <w:r>
+        <w:rPr>
+          <w:b/>
+          <w:color w:val="2E75B6"/>
+        </w:rPr>
+        <w:t xml:space="preserve">Tip: </w:t>
+      </w:r>
+      <w:r>
+        <w:t>4.1 Status: participants should click the 'Status' row (field label literally 'Status'). The page also contains a 'Case Status' section heading; that's not the row to click. Say this on your projected screen.</w:t>
+      </w:r>
+    </w:p>
+    <w:p>
+      <w:pPr>
+        <w:spacing w:before="80" w:after="80"/>
+        <w:ind w:left="227"/>
+      </w:pPr>
+      <w:r>
+        <w:rPr>
+          <w:b/>
+          <w:color w:val="2E75B6"/>
+        </w:rPr>
+        <w:t xml:space="preserve">Tip: </w:t>
+      </w:r>
+      <w:r>
+        <w:t>4.2 Support Processes lives at Setup &gt; Quick Find &gt; 'Support Processes' — NOT under Object Manager. Several participants will instinctively look inside Case. Pre-empt by projecting the navigation.</w:t>
       </w:r>
     </w:p>
     <w:p>
@@ -665,6 +883,38 @@
       </w:r>
       <w:r>
         <w:t>The Make Available step (checking System Administrator) is the #1 silent failure in Record Type creation. Reinforce: 'If you don't check System Administrator here, your Record Type exists but no one can use it.'</w:t>
+      </w:r>
+    </w:p>
+    <w:p>
+      <w:pPr>
+        <w:spacing w:before="80" w:after="80"/>
+        <w:ind w:left="227"/>
+      </w:pPr>
+      <w:r>
+        <w:rPr>
+          <w:b/>
+          <w:color w:val="2E75B6"/>
+        </w:rPr>
+        <w:t xml:space="preserve">Tip: </w:t>
+      </w:r>
+      <w:r>
+        <w:t>Each sub-part (5.1 - 5.4) now opens with an explicit navigation step. 5.1 goes Setup &gt; Object Manager &gt; Case &gt; Record Types &gt; New. 5.2 - 5.4 pivot back via the breadcrumb or left sidebar 'Record Types' link. If a participant lands on the wrong object's Record Types, surface them back to Case explicitly.</w:t>
+      </w:r>
+    </w:p>
+    <w:p>
+      <w:pPr>
+        <w:spacing w:before="80" w:after="80"/>
+        <w:ind w:left="227"/>
+      </w:pPr>
+      <w:r>
+        <w:rPr>
+          <w:b/>
+          <w:color w:val="2E75B6"/>
+        </w:rPr>
+        <w:t xml:space="preserve">Tip: </w:t>
+      </w:r>
+      <w:r>
+        <w:t>Page Layout assignment now explicitly says 'select Case Layout for System Administrator (first row)'. Previously said 'leave default' which was ambiguous. Walk through this on your screen the first time; subsequent Record Types repeat the same pattern.</w:t>
       </w:r>
     </w:p>
     <w:p>

</xml_diff>

<commit_message>
r12: Lab 1 Part 6+ fixes, cross-lab nav preambles, em dash scrub
</commit_message>
<xml_diff>
--- a/workshop-site/labs/Lab 01 - Instructor Notes.docx
+++ b/workshop-site/labs/Lab 01 - Instructor Notes.docx
@@ -12,7 +12,7 @@
           <w:color w:val="1F4E79"/>
           <w:sz w:val="40"/>
         </w:rPr>
-        <w:t>Lab 1 — Instructor Notes</w:t>
+        <w:t>Lab 1: Instructor Notes</w:t>
       </w:r>
     </w:p>
     <w:p>
@@ -25,7 +25,7 @@
           <w:color w:val="6A6A6A"/>
           <w:sz w:val="20"/>
         </w:rPr>
-        <w:t>Extend the Case Object for Multi-Agency Intake | ServicePulse 360 Workshop v0.7 (revision 11) | Facilitator guide to the Participant guide of the same name | about 100 min of participant time | about 115 min of instructor time if you present every teaching moment</w:t>
+        <w:t>Extend the Case Object for Multi-Agency Intake | ServicePulse 360 Workshop v0.7 (revision 12) | Facilitator guide to the Participant guide of the same name | about 100 min of participant time | about 115 min of instructor time if you present every teaching moment</w:t>
       </w:r>
     </w:p>
     <w:p>
@@ -38,12 +38,12 @@
           <w:color w:val="1F4E79"/>
           <w:sz w:val="28"/>
         </w:rPr>
-        <w:t>What changed from r10</w:t>
+        <w:t>What changed from r11</w:t>
       </w:r>
     </w:p>
     <w:p>
       <w:r>
-        <w:t>Round 20 feedback: 14 participant-dry-run fixes applied for the 2026-10-20 workshop. The user-facing clarifications mostly tighten navigation preambles and remove ambiguity; mirror them here so instructor notes stay aligned.</w:t>
+        <w:t>Round 21 feedback (round 2 of Tim's live participant walkthrough on 2026-10-17): 12 Lab 1 fixes applied, mostly to Part 6 and Part 8, plus a sweep for navigation preambles at the top of every section. Nothing structural changed; the sections now orient participants to where they should be before telling them what to click.</w:t>
       </w:r>
     </w:p>
     <w:p>
@@ -52,7 +52,7 @@
         <w:spacing w:after="40"/>
       </w:pPr>
       <w:r>
-        <w:t>Part 0 Step 1: click New App then select New Lightning App from the menu (the top-right control is labeled New App; the Lightning option is on the dropdown).</w:t>
+        <w:t>Part 5.4: Record Type Name corrected to B_T (Salesforce replaces &amp; with _ in Developer Names, giving B_T, not BandT). Lab 1.5, Lab 5, and Lab 7 references were updated to match.</w:t>
       </w:r>
     </w:p>
     <w:p>
@@ -61,7 +61,7 @@
         <w:spacing w:after="40"/>
       </w:pPr>
       <w:r>
-        <w:t>Part 0 Open the app: participants now also drag ServicePulse 360 to the top of the View All list.</w:t>
+        <w:t>Part 6.1: now opens with an explicit navigation step that calls out Page Layouts specifically (not Lightning Record Pages or Compact Layouts) and clicks the layout literally named 'Case Layout'.</w:t>
       </w:r>
     </w:p>
     <w:p>
@@ -70,7 +70,7 @@
         <w:spacing w:after="40"/>
       </w:pPr>
       <w:r>
-        <w:t>Part 1 Step 2: Quick Find alternative added to filter Object Manager.</w:t>
+        <w:t>Part 6.2: Case Record Type moved from Case Details to System Information (keeps user-chosen fields in Case Details and read-only system metadata grouped at the bottom).</w:t>
       </w:r>
     </w:p>
     <w:p>
@@ -79,7 +79,7 @@
         <w:spacing w:after="40"/>
       </w:pPr>
       <w:r>
-        <w:t>Part 2 opens with an explicit navigation preamble to Object Manager &gt; Case &gt; Fields &amp; Relationships.</w:t>
+        <w:t>Part 6.2: Resolution Notes drag step rewritten as a verify step (the field is placed automatically when created in Part 3.1 via the FLS/Page Layouts defaults).</w:t>
       </w:r>
     </w:p>
     <w:p>
@@ -88,7 +88,7 @@
         <w:spacing w:after="40"/>
       </w:pPr>
       <w:r>
-        <w:t>Part 2 removed the stale 'Same physical interface as adding a new picklist field' paragraph.</w:t>
+        <w:t>Part 6.4: reframed from 'assign the layout' to 'verify assignments', with a dedicated navigation step to the Page Layout Assignment page.</w:t>
       </w:r>
     </w:p>
     <w:p>
@@ -97,7 +97,7 @@
         <w:spacing w:after="40"/>
       </w:pPr>
       <w:r>
-        <w:t>Part 2.1 now splits default-setting from deactivation into separate steps and adds a Watch Out about the 15-30s UI delay on Deactivate.</w:t>
+        <w:t>Part 6.5: added a Note about Work Orders. It may not be in the Related Lists section by default and participants should drag it in if missing (Lab 4 uses it).</w:t>
       </w:r>
     </w:p>
     <w:p>
@@ -106,7 +106,7 @@
         <w:spacing w:after="40"/>
       </w:pPr>
       <w:r>
-        <w:t>Part 2.2 Step 1 now clarifies to click the Field Label 'Type' row (not any section heading containing the word Type).</w:t>
+        <w:t>Part 6.1, 6.3, 6.5: added navigation preambles so the section stands on its own if the participant lost focus or returned from a break.</w:t>
       </w:r>
     </w:p>
     <w:p>
@@ -115,7 +115,7 @@
         <w:spacing w:after="40"/>
       </w:pPr>
       <w:r>
-        <w:t>Part 3.1 begins with an explicit navigation step to Fields &amp; Relationships.</w:t>
+        <w:t>Part 7: added an explicit navigation step (Setup, Object Manager, Case, Compact Layouts) and a 'click New' step before field selection.</w:t>
       </w:r>
     </w:p>
     <w:p>
@@ -124,7 +124,7 @@
         <w:spacing w:after="40"/>
       </w:pPr>
       <w:r>
-        <w:t>Part 4.1 clarifies to click the field 'Status' (not any section titled 'Case Status').</w:t>
+        <w:t>Part 7: compact layout field order instruction now says 'IN THIS EXACT ORDER' (compact layouts honor Selected Fields order).</w:t>
       </w:r>
     </w:p>
     <w:p>
@@ -133,7 +133,7 @@
         <w:spacing w:after="40"/>
       </w:pPr>
       <w:r>
-        <w:t>Part 4.2 Support Processes navigation is now explicit numbered steps rather than prose.</w:t>
+        <w:t>Part 8.1 step 7: filter dialog button is labeled Save (not Done); step rewritten with transition words and the correct button name.</w:t>
       </w:r>
     </w:p>
     <w:p>
@@ -142,7 +142,7 @@
         <w:spacing w:after="40"/>
       </w:pPr>
       <w:r>
-        <w:t>Part 5.1 - 5.4 each start with an explicit navigation step to the Case Record Types page and clicking New.</w:t>
+        <w:t>Part 8.2: opening step clarifies to open the Open Cases list view via the list view selector dropdown; Filter icon step adds a note for screen sizes where the Filter panel is already visible.</w:t>
       </w:r>
     </w:p>
     <w:p>
@@ -151,7 +151,7 @@
         <w:spacing w:after="40"/>
       </w:pPr>
       <w:r>
-        <w:t>Part 5.1 - 5.4 Page Layout assignment: participants now explicitly select 'Case Layout' from the dropdown (instead of 'leave default').</w:t>
+        <w:t>Parts 9 and 10: navigation preambles added to every sub-section opening.</w:t>
       </w:r>
     </w:p>
     <w:p>
@@ -447,7 +447,7 @@
           <w:color w:val="1F4E79"/>
           <w:sz w:val="28"/>
         </w:rPr>
-        <w:t>The arc of this lab — what to establish verbally before Part 0</w:t>
+        <w:t>The arc of this lab: what to establish verbally before Part 0</w:t>
       </w:r>
     </w:p>
     <w:p>
@@ -492,7 +492,7 @@
           <w:color w:val="1F4E79"/>
           <w:sz w:val="28"/>
         </w:rPr>
-        <w:t>Part 0 — Create the ServicePulse 360 Lightning App (8 min)</w:t>
+        <w:t>Part 0: Create the ServicePulse 360 Lightning App (8 min)</w:t>
       </w:r>
     </w:p>
     <w:p>
@@ -569,7 +569,7 @@
           <w:color w:val="1F4E79"/>
           <w:sz w:val="28"/>
         </w:rPr>
-        <w:t>Part 1 — Tour the standard Case object (5 min)</w:t>
+        <w:t>Part 1: Tour the standard Case object (5 min)</w:t>
       </w:r>
     </w:p>
     <w:p>
@@ -614,7 +614,7 @@
           <w:color w:val="1F4E79"/>
           <w:sz w:val="28"/>
         </w:rPr>
-        <w:t>Part 2 — Customize Priority and Type (10 min)</w:t>
+        <w:t>Part 2: Customize Priority and Type (10 min)</w:t>
       </w:r>
     </w:p>
     <w:p>
@@ -723,7 +723,7 @@
           <w:color w:val="1F4E79"/>
           <w:sz w:val="28"/>
         </w:rPr>
-        <w:t>Part 3 — Add the two custom fields (10 min)</w:t>
+        <w:t>Part 3: Add the two custom fields (10 min)</w:t>
       </w:r>
     </w:p>
     <w:p>
@@ -784,7 +784,7 @@
           <w:color w:val="1F4E79"/>
           <w:sz w:val="28"/>
         </w:rPr>
-        <w:t>Part 4 — Confirm Status + Build Support Process (4 min)</w:t>
+        <w:t>Part 4: Confirm Status + Build Support Process (4 min)</w:t>
       </w:r>
     </w:p>
     <w:p>
@@ -832,7 +832,7 @@
         <w:t xml:space="preserve">Tip: </w:t>
       </w:r>
       <w:r>
-        <w:t>4.2 Support Processes lives at Setup &gt; Quick Find &gt; 'Support Processes' — NOT under Object Manager. Several participants will instinctively look inside Case. Pre-empt by projecting the navigation.</w:t>
+        <w:t>4.2 Support Processes lives at Setup &gt; Quick Find &gt; 'Support Processes', NOT under Object Manager. Several participants will instinctively look inside Case. Pre-empt by projecting the navigation.</w:t>
       </w:r>
     </w:p>
     <w:p>
@@ -845,7 +845,7 @@
           <w:color w:val="1F4E79"/>
           <w:sz w:val="28"/>
         </w:rPr>
-        <w:t>Part 5 — Create the four Record Types (15 min)</w:t>
+        <w:t>Part 5: Create the four Record Types (15 min)</w:t>
       </w:r>
     </w:p>
     <w:p>
@@ -925,6 +925,22 @@
       <w:r>
         <w:rPr>
           <w:b/>
+          <w:color w:val="2E75B6"/>
+        </w:rPr>
+        <w:t xml:space="preserve">Tip: </w:t>
+      </w:r>
+      <w:r>
+        <w:t>5.4 B&amp;T Record Type Name: Salesforce replaces &amp; with an underscore when auto-filling the Developer Name. Expected result: Record Type Label = B&amp;T, Record Type Name = B_T. This is a change from older revisions of this lab that said BandT; the real auto-fill behavior gives B_T. Walk through it on your screen so participants don't fight the auto-fill.</w:t>
+      </w:r>
+    </w:p>
+    <w:p>
+      <w:pPr>
+        <w:spacing w:before="80" w:after="80"/>
+        <w:ind w:left="227"/>
+      </w:pPr>
+      <w:r>
+        <w:rPr>
+          <w:b/>
           <w:color w:val="C0392B"/>
         </w:rPr>
         <w:t xml:space="preserve">Common error: </w:t>
@@ -975,7 +991,7 @@
           <w:color w:val="1F4E79"/>
           <w:sz w:val="28"/>
         </w:rPr>
-        <w:t>Part 6 — Configure the classic page layout (12 min)</w:t>
+        <w:t>Part 6: Configure the classic page layout (12 min)</w:t>
       </w:r>
     </w:p>
     <w:p>
@@ -1007,7 +1023,7 @@
         <w:t xml:space="preserve">Teaching moment: </w:t>
       </w:r>
       <w:r>
-        <w:t>Case Record Type field on the layout: 'You've built four Record Types; now the page layout surfaces which one a given Case belongs to. Without this field on the layout, users can see the RT in the record URL but not in the record body.'</w:t>
+        <w:t>Case Record Type field placement, revised in r12: now goes to the System Information section (not Case Details). Say explicitly: 'Case Details is for the user-chosen fields the agent cares about in triage. System Information groups the read-only system metadata like Created By, Last Modified, and the Record Type the record was filed under. Case Record Type is metadata, so System Information is its right home.'</w:t>
       </w:r>
     </w:p>
     <w:p>
@@ -1034,6 +1050,38 @@
       <w:r>
         <w:rPr>
           <w:b/>
+          <w:color w:val="2E75B6"/>
+        </w:rPr>
+        <w:t xml:space="preserve">Tip: </w:t>
+      </w:r>
+      <w:r>
+        <w:t>Part 6.4 is now a verify step, not an assign step. In 90% of orgs the Page Layout Assignment is already correct (because Part 5 selected Case Layout at Record Type creation time). Walk the Page Layout Assignment page to confirm, but don't belabor it. If a participant does find a wrong assignment, use Shift-click to multi-select and Save.</w:t>
+      </w:r>
+    </w:p>
+    <w:p>
+      <w:pPr>
+        <w:spacing w:before="80" w:after="80"/>
+        <w:ind w:left="227"/>
+      </w:pPr>
+      <w:r>
+        <w:rPr>
+          <w:b/>
+          <w:color w:val="2E75B6"/>
+        </w:rPr>
+        <w:t xml:space="preserve">Tip: </w:t>
+      </w:r>
+      <w:r>
+        <w:t>Part 6.5 adds a Note about Work Orders. Many Pronto orgs don't have Work Orders in the Case Layout's Related Lists section by default. Participants should drag it in from the palette if missing, because Lab 4 uses it.</w:t>
+      </w:r>
+    </w:p>
+    <w:p>
+      <w:pPr>
+        <w:spacing w:before="80" w:after="80"/>
+        <w:ind w:left="227"/>
+      </w:pPr>
+      <w:r>
+        <w:rPr>
+          <w:b/>
           <w:color w:val="C0392B"/>
         </w:rPr>
         <w:t xml:space="preserve">Common error: </w:t>
@@ -1055,7 +1103,7 @@
         <w:t xml:space="preserve">Common error: </w:t>
       </w:r>
       <w:r>
-        <w:t>Participant skips the Shift-click multi-select in Page Layout Assignment. Fix: return to Page Layout Assignment, Edit Assignment, Shift-click all four System Administrator rows, set Page Layout to 'Case Layout', Save.</w:t>
+        <w:t>Participant skips Resolution Notes verify in 6.2. Fix: scroll to Description Information; if Resolution Notes isn't there, drag it in from the palette.</w:t>
       </w:r>
     </w:p>
     <w:p>
@@ -1084,7 +1132,7 @@
           <w:color w:val="1F4E79"/>
           <w:sz w:val="28"/>
         </w:rPr>
-        <w:t>Part 7 — Configure the compact layout (5 min)</w:t>
+        <w:t>Part 7: Configure the compact layout (5 min)</w:t>
       </w:r>
     </w:p>
     <w:p>
@@ -1105,6 +1153,38 @@
     </w:p>
     <w:p>
       <w:pPr>
+        <w:spacing w:before="80" w:after="80"/>
+        <w:ind w:left="227"/>
+      </w:pPr>
+      <w:r>
+        <w:rPr>
+          <w:b/>
+          <w:color w:val="2E75B6"/>
+        </w:rPr>
+        <w:t xml:space="preserve">Tip: </w:t>
+      </w:r>
+      <w:r>
+        <w:t>r12 adds an explicit nav preamble: Setup &gt; Object Manager &gt; Case &gt; Compact Layouts &gt; New. Participants coming from Part 6 may still be on Page Layouts, which has a different sidebar entry. Project the navigation.</w:t>
+      </w:r>
+    </w:p>
+    <w:p>
+      <w:pPr>
+        <w:spacing w:before="80" w:after="80"/>
+        <w:ind w:left="227"/>
+      </w:pPr>
+      <w:r>
+        <w:rPr>
+          <w:b/>
+          <w:color w:val="2E75B6"/>
+        </w:rPr>
+        <w:t xml:space="preserve">Tip: </w:t>
+      </w:r>
+      <w:r>
+        <w:t>Field order matters on compact layouts. The r12 guide says 'IN THIS EXACT ORDER' in uppercase. Call this out: the compact layout honors the Selected Fields order top-to-bottom when rendering the highlights panel.</w:t>
+      </w:r>
+    </w:p>
+    <w:p>
+      <w:pPr>
         <w:spacing w:before="280" w:after="80"/>
       </w:pPr>
       <w:r>
@@ -1113,7 +1193,7 @@
           <w:color w:val="1F4E79"/>
           <w:sz w:val="28"/>
         </w:rPr>
-        <w:t>Part 8 — Create the list views (5 min)</w:t>
+        <w:t>Part 8: Create the list views (5 min)</w:t>
       </w:r>
     </w:p>
     <w:p>
@@ -1150,6 +1230,38 @@
     </w:p>
     <w:p>
       <w:pPr>
+        <w:spacing w:before="80" w:after="80"/>
+        <w:ind w:left="227"/>
+      </w:pPr>
+      <w:r>
+        <w:rPr>
+          <w:b/>
+          <w:color w:val="C0392B"/>
+        </w:rPr>
+        <w:t xml:space="preserve">Common error: </w:t>
+      </w:r>
+      <w:r>
+        <w:t>Participant clicks 'Done' in the filter dialog thinking it will save. The filter dialog button is labeled Save, not Done. Fix: click Save in the filter dialog.</w:t>
+      </w:r>
+    </w:p>
+    <w:p>
+      <w:pPr>
+        <w:spacing w:before="80" w:after="80"/>
+        <w:ind w:left="227"/>
+      </w:pPr>
+      <w:r>
+        <w:rPr>
+          <w:b/>
+          <w:color w:val="2E75B6"/>
+        </w:rPr>
+        <w:t xml:space="preserve">Tip: </w:t>
+      </w:r>
+      <w:r>
+        <w:t>8.2 Filter icon: on wide monitors the Filter panel is already visible, so step 3 is a no-op. On smaller screens participants need to click the funnel icon to show the panel. The r12 guide adds this as a note.</w:t>
+      </w:r>
+    </w:p>
+    <w:p>
+      <w:pPr>
         <w:spacing w:before="280" w:after="80"/>
       </w:pPr>
       <w:r>
@@ -1158,7 +1270,7 @@
           <w:color w:val="1F4E79"/>
           <w:sz w:val="28"/>
         </w:rPr>
-        <w:t>Part 9 — Place custom fields, Case Record Type, and Asset on the Lightning record page via Dynamic Forms (12 min)</w:t>
+        <w:t>Part 9: Place custom fields, Case Record Type, and Asset on the Lightning record page via Dynamic Forms (12 min)</w:t>
       </w:r>
     </w:p>
     <w:p>
@@ -1299,7 +1411,7 @@
           <w:color w:val="1F4E79"/>
           <w:sz w:val="28"/>
         </w:rPr>
-        <w:t>Part 10 — Create the Golden Record (10 min)</w:t>
+        <w:t>Part 10: Create the Golden Record (10 min)</w:t>
       </w:r>
     </w:p>
     <w:p>
@@ -1424,7 +1536,7 @@
           <w:color w:val="1F4E79"/>
           <w:sz w:val="28"/>
         </w:rPr>
-        <w:t>After Lab 01 — before Lab 02</w:t>
+        <w:t>After Lab 01: before Lab 02</w:t>
       </w:r>
     </w:p>
     <w:p>
@@ -1469,7 +1581,7 @@
           <w:color w:val="1F4E79"/>
           <w:sz w:val="28"/>
         </w:rPr>
-        <w:t>Teaching register — Tim's reminder to self</w:t>
+        <w:t>Teaching register: Tim's reminder to self</w:t>
       </w:r>
     </w:p>
     <w:p>

</xml_diff>

<commit_message>
Lab 1 Part 9/10 feedback: 6.6 Pronto field cleanup, 9.1-9.5 wording fixes, 10.1 missing-accounts callout removed, Description step added to Golden Record
</commit_message>
<xml_diff>
--- a/workshop-site/labs/Lab 01 - Instructor Notes.docx
+++ b/workshop-site/labs/Lab 01 - Instructor Notes.docx
@@ -1124,6 +1124,22 @@
     </w:p>
     <w:p>
       <w:pPr>
+        <w:spacing w:before="80" w:after="80"/>
+        <w:ind w:left="227"/>
+      </w:pPr>
+      <w:r>
+        <w:rPr>
+          <w:b/>
+          <w:color w:val="A35029"/>
+        </w:rPr>
+        <w:t xml:space="preserve">Teaching moment: </w:t>
+      </w:r>
+      <w:r>
+        <w:t>New 6.6 step removes leftover Pronto fields from the Case Layout: the Related Storefront section, the Business Account field, the Storefront field, and the Case Reason field. Say explicitly: "These are starter-content leftovers from the Pronto template that don't apply to MTA's Case model. Removing them keeps the layout focused on what dispatchers actually use." This is a straightforward removal step; it shouldn't need much airtime.</w:t>
+      </w:r>
+    </w:p>
+    <w:p>
+      <w:pPr>
         <w:spacing w:before="280" w:after="80"/>
       </w:pPr>
       <w:r>
@@ -1313,6 +1329,22 @@
       <w:r>
         <w:rPr>
           <w:b/>
+          <w:color w:val="2E75B6"/>
+        </w:rPr>
+        <w:t xml:space="preserve">Tip: </w:t>
+      </w:r>
+      <w:r>
+        <w:t>Reported Date/Time is already placed on the canvas (the scaffolding pre-deploys it). 9.2 is now a verify step, not a drag-on step. Don't let participants spend time hunting for a drag action that isn't needed; have them confirm it's visible in Case Details and move on. If it's genuinely missing on someone's org, that's when they drag it in.</w:t>
+      </w:r>
+    </w:p>
+    <w:p>
+      <w:pPr>
+        <w:spacing w:before="80" w:after="80"/>
+        <w:ind w:left="227"/>
+      </w:pPr>
+      <w:r>
+        <w:rPr>
+          <w:b/>
           <w:color w:val="A35029"/>
         </w:rPr>
         <w:t xml:space="preserve">Teaching moment: </w:t>
@@ -1459,7 +1491,7 @@
         <w:t xml:space="preserve">Golden Record spec: </w:t>
       </w:r>
       <w:r>
-        <w:t>Record Type = NYCT, Priority = P3 - Medium (default), Status = New, Type = Track Defect, Case Origin = Phone, Reported Date/Time = (auto), Subject = "Golden Record: Workshop reference case", Contact Name = (participant choice; MTA agency contacts preferred if available), Account Name = MTA New York City Transit.</w:t>
+        <w:t>Record Type = NYCT, Priority = P3 - Medium (default), Status = New, Type = Track Defect, Case Origin = Phone, Reported Date/Time = (auto), Subject = "Golden Record: Workshop reference case", Description = (short narrative the participant writes), Contact Name = (participant choice; MTA agency contacts preferred if available), Account Name = MTA New York City Transit.</w:t>
       </w:r>
     </w:p>
     <w:p>
@@ -1491,7 +1523,7 @@
         <w:t xml:space="preserve">Common error: </w:t>
       </w:r>
       <w:r>
-        <w:t>MTA New York City Transit isn't in the Account picker. The scaffolding didn't deploy the Accounts. Fix: follow the Part 10.1 'if missing' callout in the Participant guide. (This should be caught in pre-workshop setup, but might surface here.)</w:t>
+        <w:t>MTA New York City Transit isn't in the Account picker. The scaffolding didn't deploy the Accounts correctly on that org. This should be caught in pre-workshop setup; if it surfaces here, don't have the participant create Accounts manually, pull them aside and investigate the org's deploy state.</w:t>
       </w:r>
     </w:p>
     <w:p>

</xml_diff>

<commit_message>
Add Instructor Notes inline preview for all 8 labs; fix Case list view Pronto-noise filter in Lab 1 Part 8 and Lab 1.5
</commit_message>
<xml_diff>
--- a/workshop-site/labs/Lab 01 - Instructor Notes.docx
+++ b/workshop-site/labs/Lab 01 - Instructor Notes.docx
@@ -1274,6 +1274,22 @@
       </w:r>
       <w:r>
         <w:t>8.2 Filter icon: on wide monitors the Filter panel is already visible, so step 3 is a no-op. On smaller screens participants need to click the funnel icon to show the panel. The r12 guide adds this as a note.</w:t>
+      </w:r>
+    </w:p>
+    <w:p>
+      <w:pPr>
+        <w:spacing w:before="80" w:after="80"/>
+        <w:ind w:left="227"/>
+      </w:pPr>
+      <w:r>
+        <w:rPr>
+          <w:b/>
+          <w:color w:val="A35029"/>
+        </w:rPr>
+        <w:t xml:space="preserve">Teaching moment: </w:t>
+      </w:r>
+      <w:r>
+        <w:t>New 8.1 step 8 adds an Account Name contains MTA filter alongside the Status filter. Without it, both list views show all 27 Cases in the org (16 leftover Pronto demo Cases plus the 10 seeded MTA Cases plus the Golden Record), not the 11 MTA Cases the lab expects. Call this out explicitly: "We just told you to expect 11 Cases total once you have your Golden Record. This filter is what makes that true, otherwise you'd see the Pronto template's own demo data mixed in."</w:t>
       </w:r>
     </w:p>
     <w:p>

</xml_diff>